<commit_message>
Resume: Cyber Security Intern Penetration Testing @ Unknown (unknown)
</commit_message>
<xml_diff>
--- a/resumes/Resume_Cyber_Security_Intern_Penetration_T_Unknown__unknown_.docx
+++ b/resumes/Resume_Cyber_Security_Intern_Penetration_T_Unknown__unknown_.docx
@@ -117,7 +117,7 @@
         <w:pBdr>
           <w:bottom w:val="single" w:sz="6" w:space="1" w:color="000000"/>
         </w:pBdr>
-        <w:spacing w:before="99" w:after="0"/>
+        <w:spacing w:before="70" w:after="0"/>
       </w:pPr>
       <w:r>
         <w:rPr>
@@ -295,7 +295,7 @@
     </w:p>
     <w:p>
       <w:pPr>
-        <w:spacing w:before="20" w:after="20"/>
+        <w:spacing w:before="13" w:after="13"/>
       </w:pPr>
     </w:p>
     <w:p>
@@ -303,7 +303,7 @@
         <w:pBdr>
           <w:bottom w:val="single" w:sz="6" w:space="1" w:color="000000"/>
         </w:pBdr>
-        <w:spacing w:before="99" w:after="0"/>
+        <w:spacing w:before="70" w:after="0"/>
       </w:pPr>
       <w:r>
         <w:rPr>
@@ -421,16 +421,16 @@
           <w:ilvl w:val="0"/>
           <w:numId w:val="2"/>
         </w:numPr>
-        <w:spacing w:before="13" w:after="30"/>
-      </w:pPr>
-      <w:r>
-        <w:rPr>
-          <w:rFonts w:ascii="Source Sans Pro" w:eastAsia="Source Sans Pro" w:hAnsi="Source Sans Pro" w:cs="Source Sans Pro"/>
-          <w:color w:val="000000"/>
-          <w:sz w:val="19"/>
-          <w:szCs w:val="19"/>
-        </w:rPr>
-        <w:t>Triaged 50+ weekly inventory reimbursement cases by severity and policy, reducing repeat-issue investigation time.</w:t>
+        <w:spacing w:before="13" w:after="23"/>
+      </w:pPr>
+      <w:r>
+        <w:rPr>
+          <w:rFonts w:ascii="Source Sans Pro" w:eastAsia="Source Sans Pro" w:hAnsi="Source Sans Pro" w:cs="Source Sans Pro"/>
+          <w:color w:val="000000"/>
+          <w:sz w:val="19"/>
+          <w:szCs w:val="19"/>
+        </w:rPr>
+        <w:t>Triaged 50+ weekly inventory reimbursement cases by severity and policy eligibility, translating high-volume case review into structured investigation, escalation, and evidence documentation.</w:t>
       </w:r>
     </w:p>
     <w:p>
@@ -440,16 +440,16 @@
           <w:ilvl w:val="0"/>
           <w:numId w:val="2"/>
         </w:numPr>
-        <w:spacing w:before="13" w:after="30"/>
-      </w:pPr>
-      <w:r>
-        <w:rPr>
-          <w:rFonts w:ascii="Source Sans Pro" w:eastAsia="Source Sans Pro" w:hAnsi="Source Sans Pro" w:cs="Source Sans Pro"/>
-          <w:color w:val="000000"/>
-          <w:sz w:val="19"/>
-          <w:szCs w:val="19"/>
-        </w:rPr>
-        <w:t>Investigated root cause analysis on seller claims, identified policy violations and anomalous patterns, and escalated findings to senior reviewers, prioritizing risk impact and severity.</w:t>
+        <w:spacing w:before="13" w:after="23"/>
+      </w:pPr>
+      <w:r>
+        <w:rPr>
+          <w:rFonts w:ascii="Source Sans Pro" w:eastAsia="Source Sans Pro" w:hAnsi="Source Sans Pro" w:cs="Source Sans Pro"/>
+          <w:color w:val="000000"/>
+          <w:sz w:val="19"/>
+          <w:szCs w:val="19"/>
+        </w:rPr>
+        <w:t>Conducted root cause analysis on seller claims, identifying policy violations and anomalous patterns for pattern review and investigation handoffs.</w:t>
       </w:r>
     </w:p>
     <w:p>
@@ -459,16 +459,16 @@
           <w:ilvl w:val="0"/>
           <w:numId w:val="2"/>
         </w:numPr>
-        <w:spacing w:before="13" w:after="30"/>
-      </w:pPr>
-      <w:r>
-        <w:rPr>
-          <w:rFonts w:ascii="Source Sans Pro" w:eastAsia="Source Sans Pro" w:hAnsi="Source Sans Pro" w:cs="Source Sans Pro"/>
-          <w:color w:val="000000"/>
-          <w:sz w:val="19"/>
-          <w:szCs w:val="19"/>
-        </w:rPr>
-        <w:t>Analyzed 200+ weekly cases to spot recurring fraud patterns, flagging them early to reduce repeat-issue investigation time before escalation, and ensuring evidence review and remediation tracking.</w:t>
+        <w:spacing w:before="13" w:after="23"/>
+      </w:pPr>
+      <w:r>
+        <w:rPr>
+          <w:rFonts w:ascii="Source Sans Pro" w:eastAsia="Source Sans Pro" w:hAnsi="Source Sans Pro" w:cs="Source Sans Pro"/>
+          <w:color w:val="000000"/>
+          <w:sz w:val="19"/>
+          <w:szCs w:val="19"/>
+        </w:rPr>
+        <w:t>Maintained audit-ready case documentation with findings, decisions, evidence notes, and corrective actions aligned to evidence documentation and decision trails.</w:t>
       </w:r>
     </w:p>
     <w:p>
@@ -478,16 +478,16 @@
           <w:ilvl w:val="0"/>
           <w:numId w:val="2"/>
         </w:numPr>
-        <w:spacing w:before="13" w:after="30"/>
-      </w:pPr>
-      <w:r>
-        <w:rPr>
-          <w:rFonts w:ascii="Source Sans Pro" w:eastAsia="Source Sans Pro" w:hAnsi="Source Sans Pro" w:cs="Source Sans Pro"/>
-          <w:color w:val="000000"/>
-          <w:sz w:val="19"/>
-          <w:szCs w:val="19"/>
-        </w:rPr>
-        <w:t>Documented audit-ready case records, recording investigation findings, decisions, evidence notes, and corrective actions, maintaining accurate and thorough case documentation.</w:t>
+        <w:spacing w:before="13" w:after="23"/>
+      </w:pPr>
+      <w:r>
+        <w:rPr>
+          <w:rFonts w:ascii="Source Sans Pro" w:eastAsia="Source Sans Pro" w:hAnsi="Source Sans Pro" w:cs="Source Sans Pro"/>
+          <w:color w:val="000000"/>
+          <w:sz w:val="19"/>
+          <w:szCs w:val="19"/>
+        </w:rPr>
+        <w:t>Spotted recurring fraud patterns across 200+ weekly cases and flagged repeat issues early, reducing investigation cycles before escalation.</w:t>
       </w:r>
     </w:p>
     <w:p>
@@ -495,7 +495,7 @@
         <w:pBdr>
           <w:bottom w:val="single" w:sz="6" w:space="1" w:color="000000"/>
         </w:pBdr>
-        <w:spacing w:before="20" w:after="20"/>
+        <w:spacing w:before="13" w:after="13"/>
         <w:rPr>
           <w:rFonts w:ascii="Source Sans Pro" w:eastAsia="Source Sans Pro" w:hAnsi="Source Sans Pro" w:cs="Source Sans Pro"/>
           <w:b/>
@@ -511,7 +511,7 @@
         <w:pBdr>
           <w:bottom w:val="single" w:sz="6" w:space="1" w:color="000000"/>
         </w:pBdr>
-        <w:spacing w:before="99" w:after="0"/>
+        <w:spacing w:before="70" w:after="0"/>
       </w:pPr>
       <w:r>
         <w:rPr>
@@ -579,16 +579,16 @@
           <w:ilvl w:val="0"/>
           <w:numId w:val="2"/>
         </w:numPr>
-        <w:spacing w:before="13" w:after="30"/>
-      </w:pPr>
-      <w:r>
-        <w:rPr>
-          <w:rFonts w:ascii="Source Sans Pro" w:eastAsia="Source Sans Pro" w:hAnsi="Source Sans Pro" w:cs="Source Sans Pro"/>
-          <w:color w:val="000000"/>
-          <w:sz w:val="19"/>
-          <w:szCs w:val="19"/>
-        </w:rPr>
-        <w:t>Developed automated application security testing pipeline integrating Nessus and OpenVAS APIs in Python, generating vulnerability reports with EPSS context from FIRST.org API and CVSS severity classification.</w:t>
+        <w:spacing w:before="13" w:after="23"/>
+      </w:pPr>
+      <w:r>
+        <w:rPr>
+          <w:rFonts w:ascii="Source Sans Pro" w:eastAsia="Source Sans Pro" w:hAnsi="Source Sans Pro" w:cs="Source Sans Pro"/>
+          <w:color w:val="000000"/>
+          <w:sz w:val="19"/>
+          <w:szCs w:val="19"/>
+        </w:rPr>
+        <w:t>Developed automated security testing pipeline integrating Nessus and OpenVAS APIs in Python, generating vulnerability reports with EPSS context from FIRST.org API and CVSS severity classification.</w:t>
       </w:r>
     </w:p>
     <w:p>
@@ -598,16 +598,16 @@
           <w:ilvl w:val="0"/>
           <w:numId w:val="2"/>
         </w:numPr>
-        <w:spacing w:before="13" w:after="30"/>
-      </w:pPr>
-      <w:r>
-        <w:rPr>
-          <w:rFonts w:ascii="Source Sans Pro" w:eastAsia="Source Sans Pro" w:hAnsi="Source Sans Pro" w:cs="Source Sans Pro"/>
-          <w:color w:val="000000"/>
-          <w:sz w:val="19"/>
-          <w:szCs w:val="19"/>
-        </w:rPr>
-        <w:t>Developed OWASP Top 10 automated security checker detecting injection, SSRF, XSS vulnerabilities, and documented SQL injection exploit-to-remediation workflow.</w:t>
+        <w:spacing w:before="13" w:after="23"/>
+      </w:pPr>
+      <w:r>
+        <w:rPr>
+          <w:rFonts w:ascii="Source Sans Pro" w:eastAsia="Source Sans Pro" w:hAnsi="Source Sans Pro" w:cs="Source Sans Pro"/>
+          <w:color w:val="000000"/>
+          <w:sz w:val="19"/>
+          <w:szCs w:val="19"/>
+        </w:rPr>
+        <w:t>Developed OWASP Top 10 automated security checker detecting injection, SSRF, and XSS vulnerabilities; documented SQL injection exploit-to-remediation workflow with parameterised query fixes.</w:t>
       </w:r>
     </w:p>
     <w:p>
@@ -617,7 +617,7 @@
           <w:ilvl w:val="0"/>
           <w:numId w:val="2"/>
         </w:numPr>
-        <w:spacing w:before="13" w:after="30"/>
+        <w:spacing w:before="13" w:after="23"/>
       </w:pPr>
       <w:r>
         <w:rPr>
@@ -631,7 +631,7 @@
     </w:p>
     <w:p>
       <w:pPr>
-        <w:spacing w:before="20" w:after="20"/>
+        <w:spacing w:before="13" w:after="13"/>
       </w:pPr>
     </w:p>
     <w:p>
@@ -688,16 +688,16 @@
           <w:ilvl w:val="0"/>
           <w:numId w:val="2"/>
         </w:numPr>
-        <w:spacing w:before="13" w:after="30"/>
-      </w:pPr>
-      <w:r>
-        <w:rPr>
-          <w:rFonts w:ascii="Source Sans Pro" w:eastAsia="Source Sans Pro" w:hAnsi="Source Sans Pro" w:cs="Source Sans Pro"/>
-          <w:color w:val="000000"/>
-          <w:sz w:val="19"/>
-          <w:szCs w:val="19"/>
-        </w:rPr>
-        <w:t>Deployed Splunk SIEM with SPL searches for brute-force detection, lateral movement, and privilege escalation, mapped to MITRE ATT&amp;CK TTPs and wrote PICERL incident report for FIRST.org.</w:t>
+        <w:spacing w:before="13" w:after="23"/>
+      </w:pPr>
+      <w:r>
+        <w:rPr>
+          <w:rFonts w:ascii="Source Sans Pro" w:eastAsia="Source Sans Pro" w:hAnsi="Source Sans Pro" w:cs="Source Sans Pro"/>
+          <w:color w:val="000000"/>
+          <w:sz w:val="19"/>
+          <w:szCs w:val="19"/>
+        </w:rPr>
+        <w:t>Deployed Splunk SIEM with SPL correlation searches for brute-force detection, lateral movement, and privilege escalation; mapped TTPs to MITRE ATT&amp;CK and wrote PICERL incident report for FIRST.org.</w:t>
       </w:r>
     </w:p>
     <w:p>
@@ -707,7 +707,7 @@
           <w:ilvl w:val="0"/>
           <w:numId w:val="2"/>
         </w:numPr>
-        <w:spacing w:before="13" w:after="30"/>
+        <w:spacing w:before="13" w:after="23"/>
       </w:pPr>
       <w:r>
         <w:rPr>
@@ -726,7 +726,7 @@
           <w:ilvl w:val="0"/>
           <w:numId w:val="2"/>
         </w:numPr>
-        <w:spacing w:before="13" w:after="30"/>
+        <w:spacing w:before="13" w:after="23"/>
       </w:pPr>
       <w:r>
         <w:rPr>
@@ -743,7 +743,7 @@
         <w:pBdr>
           <w:bottom w:val="single" w:sz="6" w:space="1" w:color="000000"/>
         </w:pBdr>
-        <w:spacing w:before="20" w:after="20"/>
+        <w:spacing w:before="13" w:after="13"/>
         <w:rPr>
           <w:rFonts w:ascii="Source Sans Pro" w:eastAsia="Source Sans Pro" w:hAnsi="Source Sans Pro" w:cs="Source Sans Pro"/>
           <w:b/>
@@ -759,7 +759,7 @@
         <w:pBdr>
           <w:bottom w:val="single" w:sz="6" w:space="1" w:color="000000"/>
         </w:pBdr>
-        <w:spacing w:before="99" w:after="0"/>
+        <w:spacing w:before="70" w:after="0"/>
       </w:pPr>
       <w:r>
         <w:rPr>
@@ -775,7 +775,7 @@
     </w:p>
     <w:p>
       <w:pPr>
-        <w:spacing w:before="44" w:after="44"/>
+        <w:spacing w:before="37" w:after="37"/>
       </w:pPr>
       <w:r>
         <w:rPr>
@@ -797,7 +797,7 @@
     </w:p>
     <w:p>
       <w:pPr>
-        <w:spacing w:before="44" w:after="44"/>
+        <w:spacing w:before="37" w:after="37"/>
       </w:pPr>
       <w:r>
         <w:rPr>
@@ -819,7 +819,7 @@
     </w:p>
     <w:p>
       <w:pPr>
-        <w:spacing w:before="44" w:after="44"/>
+        <w:spacing w:before="37" w:after="37"/>
       </w:pPr>
       <w:r>
         <w:rPr>
@@ -841,7 +841,7 @@
     </w:p>
     <w:p>
       <w:pPr>
-        <w:spacing w:before="44" w:after="44"/>
+        <w:spacing w:before="37" w:after="37"/>
       </w:pPr>
       <w:r>
         <w:rPr>
@@ -863,7 +863,7 @@
     </w:p>
     <w:p>
       <w:pPr>
-        <w:spacing w:before="44" w:after="44"/>
+        <w:spacing w:before="37" w:after="37"/>
       </w:pPr>
       <w:r>
         <w:rPr>
@@ -888,7 +888,7 @@
         <w:pBdr>
           <w:bottom w:val="single" w:sz="6" w:space="1" w:color="000000"/>
         </w:pBdr>
-        <w:spacing w:before="20" w:after="20"/>
+        <w:spacing w:before="13" w:after="13"/>
         <w:rPr>
           <w:rFonts w:ascii="Source Sans Pro" w:eastAsia="Source Sans Pro" w:hAnsi="Source Sans Pro" w:cs="Source Sans Pro"/>
           <w:b/>
@@ -904,7 +904,7 @@
         <w:pBdr>
           <w:bottom w:val="single" w:sz="6" w:space="1" w:color="000000"/>
         </w:pBdr>
-        <w:spacing w:before="99" w:after="0"/>
+        <w:spacing w:before="70" w:after="0"/>
       </w:pPr>
       <w:r>
         <w:rPr>
@@ -925,7 +925,7 @@
           <w:ilvl w:val="0"/>
           <w:numId w:val="2"/>
         </w:numPr>
-        <w:spacing w:before="13" w:after="30"/>
+        <w:spacing w:before="13" w:after="23"/>
       </w:pPr>
       <w:r>
         <w:rPr>
@@ -944,7 +944,7 @@
           <w:ilvl w:val="0"/>
           <w:numId w:val="2"/>
         </w:numPr>
-        <w:spacing w:before="13" w:after="30"/>
+        <w:spacing w:before="13" w:after="23"/>
       </w:pPr>
       <w:r>
         <w:rPr>

</xml_diff>